<commit_message>
Voice-rewrite articles 16-18, add kerphplans.com byline to all 18 articles
Batch 4's rewrite of the last 3 (16-18) completes the voice pass across
all originally-published/rewritten articles. Also adds a small
"Kerph Garage Tips · kerphplans.com" byline line near the top of every
article's body_html, per direct request -- if these get shared or
screenshotted on Instagram/Facebook, the site context (title, nav,
domain) is stripped away, so the URL needs to live inside the content
itself to keep friction low for anyone wanting to find the site.

article.docx regenerated for 17 of 18 (03-table-saw-tune-up is currently
open in Word, will regenerate once it's closed).

The new 19-understanding-kickback article (requested as an extensive,
standalone deep-dive) is still in progress -- its article.html exists but
cover photo sourcing isn't done yet, so it's held out of this commit.

Co-Authored-By: Claude Sonnet 5 <noreply@anthropic.com>
</commit_message>
<xml_diff>
--- a/Articles/16-top-10-table-saws/article.docx
+++ b/Articles/16-top-10-table-saws/article.docx
@@ -70,7 +70,7 @@
     </w:p>
     <w:p>
       <w:r>
-        <w:t xml:space="preserve">Ask five people what the "best" table saw is and you'll get five different answers, mostly depending on how much floor space and money they're working with. That's honestly the more useful way to think about this list. A $300 benchtop saw and a $3,500 cabinet saw aren't really rivals; they're solving different problems. So instead of crowning one winner, here are ten saws that keep coming up across every price bracket, and what actually sets each one apart.</w:t>
+        <w:t xml:space="preserve">Ask five people what the "best" table saw is and you'll get five different answers. That's not because nobody knows what they're talking about. It's because the question is the wrong one. The simple answer is "whichever one fits your shop and your budget." The real answer is that a $300 benchtop saw and a $3,500 cabinet saw aren't rivals at all -- they're not even solving the same problem. So instead of crowning one winner, here are ten saws that keep coming up across every price bracket, and what actually sets each one apart from the others in its own weight class.</w:t>
       </w:r>
     </w:p>
     <w:p>
@@ -91,12 +91,12 @@
     </w:p>
     <w:p>
       <w:r>
-        <w:t xml:space="preserve">Broadly, saws fall into five tiers: benchtop and jobsite saws you can carry out to a truck, contractor saws that live mostly in one place but still ride on wheels, hybrid saws with an enclosed base for real dust collection, and full cabinet saws built to run all day without complaint. Street prices roughly track that order too, from a couple hundred dollars up into five figures for the biggest industrial cabinet saws.</w:t>
-      </w:r>
-    </w:p>
-    <w:p>
-      <w:r>
-        <w:t xml:space="preserve">This isn't a lab test. It's a working list built from real specs, honest reputations, and what actually shows up in shop conversations and reviews across the price range. Ranking weighs motor power and rip capacity, fence quality, table size, safety features, and value within each saw's own category.</w:t>
+        <w:t xml:space="preserve">Broadly, saws fall into five tiers. Benchtop and jobsite saws you carry out to a truck and back. Contractor saws that live mostly in one place but still ride on wheels when they have to. Hybrid saws with an enclosed base that actually collects dust instead of just producing it. And full cabinet saws, built to run all day without complaining about it. Street prices track that order too, from a couple hundred dollars up into five figures for the biggest industrial cabinet saws -- you get what you pay for here more reliably than in most tool categories.</w:t>
+      </w:r>
+    </w:p>
+    <w:p>
+      <w:r>
+        <w:t xml:space="preserve">This isn't a lab test, and it's not pretending to be one. It's a working list built from real specs, honest reputations, and what actually shows up in shop conversations and reviews across the price range. Ranking weighs motor power and rip capacity, fence quality, table size, safety features, and value within each saw's own category -- a $300 jobsite saw isn't getting docked points for dust collection it was never built to have.</w:t>
       </w:r>
     </w:p>
     <w:p>
@@ -117,7 +117,7 @@
     </w:p>
     <w:p>
       <w:r>
-        <w:t xml:space="preserve">SawStop built its whole reputation on one feature: a flesh-detection system that stops the blade in under five milliseconds if it senses skin, dropping the assembly below the table before real damage happens. The Professional Cabinet Saw is where most shops meet that technology for the first time, and it earns its price with more than just safety -- the T-Glide fence locks in dead parallel and mostly gets set once and forgotten. At 1.75 HP and roughly 440 lbs, it's not the biggest saw on this list, but it's the one most often named when someone asks what to buy without a budget ceiling. </w:t>
+        <w:t xml:space="preserve">SawStop built its whole reputation on one feature, and it's a genuinely good one: a flesh-detection system that stops the blade in under five milliseconds if it senses skin, dropping the whole assembly below the table before real damage happens. The Professional Cabinet Saw is where most shops meet that technology for the first time, and here's the part that surprises people -- the safety feature isn't even the only reason to buy it. The T-Glide fence locks in dead parallel and mostly gets set once and stays that way. At 1.75 HP and roughly 440 lbs, it's not the biggest saw on this list. It's just the one most often named when someone asks what to buy and doesn't want to think about a budget ceiling. </w:t>
       </w:r>
       <w:hyperlink r:id="rIdLink0">
         <w:r>
@@ -158,7 +158,7 @@
     </w:p>
     <w:p>
       <w:r>
-        <w:t xml:space="preserve">Step up from the PCS and you get the Industrial Cabinet Saw: same braking technology, but built for shops that don't get a day off. Motor options run up to 5 HP with true 3-phase power, and the extra weight (around 600 lbs) shows up as noticeably less vibration at the cut. It's overkill for a home shop and exactly right for a production one. </w:t>
+        <w:t xml:space="preserve">Step up from the PCS and you land on the Industrial Cabinet Saw -- same braking technology, built for shops that don't get a day off. Motor options run up to 5 HP with true 3-phase power, and the extra weight, around 600 lbs, shows up exactly where you'd want it: noticeably less vibration at the cut. Is it overkill for a home shop? Completely. Is it exactly right for a production one? Also completely. </w:t>
       </w:r>
       <w:hyperlink r:id="rIdLink1">
         <w:r>
@@ -199,7 +199,7 @@
     </w:p>
     <w:p>
       <w:r>
-        <w:t xml:space="preserve">Powermatic's Accu-Fence is one of the most imitated fence designs in the industry, and the PM1000 is usually the saw people mean when they say they want "a Powermatic." At about 289 lbs it's genuinely lighter than a full cabinet saw, without feeling like a step down at the cut -- a common landing spot for anyone who wants cabinet-saw manners without cabinet-saw weight. </w:t>
+        <w:t xml:space="preserve">Powermatic's Accu-Fence is one of the most imitated fence designs in the industry -- enough competitors have borrowed from it that it's practically the yardstick everyone else's fence gets measured against. The PM1000 is usually the saw people mean when they say they want "a Powermatic." At about 289 lbs it's genuinely lighter than a full cabinet saw, without feeling like a downgrade at the cut. It's the common landing spot for anyone who wants cabinet-saw manners without hauling cabinet-saw weight around. </w:t>
       </w:r>
       <w:hyperlink r:id="rIdLink2">
         <w:r>
@@ -240,7 +240,7 @@
     </w:p>
     <w:p>
       <w:r>
-        <w:t xml:space="preserve">Grizzly's pitch has always been the same: give woodworkers full cabinet-saw performance without the full cabinet-saw price tag, and the G0690 is the model that gets pointed to most often as proof it works. Three horsepower, triple belt drive, a table big enough to handle full sheets -- it undercuts the name-brand competition by a wide enough margin that it's become the default answer in budget-conscious shop-building threads. </w:t>
+        <w:t xml:space="preserve">Grizzly's pitch has always been the same, and they've never really had to change it: full cabinet-saw performance without the full cabinet-saw price tag. The G0690 is the model that gets pointed to most often as proof it actually works. Three horsepower, triple belt drive, a table big enough to handle full sheets without you babysitting the offcut -- it undercuts the name-brand competition by enough that it's become the default answer in budget-conscious shop-building threads. Not the flashy pick. The correct one. </w:t>
       </w:r>
       <w:hyperlink r:id="rIdLink3">
         <w:r>
@@ -281,7 +281,7 @@
     </w:p>
     <w:p>
       <w:r>
-        <w:t xml:space="preserve">The G0715P is Grizzly's hybrid: an enclosed base for real dust collection, a lighter cast-iron table than the G0690, and a price that splits the difference between a contractor saw and a full cabinet saw. It's the saw a lot of people buy the day their jobsite saw stops being good enough, before they're ready to commit to something heavier. </w:t>
+        <w:t xml:space="preserve">The G0715P is Grizzly's hybrid: an enclosed base for real dust collection, a lighter cast-iron table than the G0690, and a price that splits the difference between a contractor saw and a full cabinet saw. It's the saw a lot of people buy the day their jobsite saw stops being good enough -- the natural next step, before anyone's quite ready to commit to something heavier. </w:t>
       </w:r>
       <w:hyperlink r:id="rIdLink4">
         <w:r>
@@ -322,7 +322,7 @@
     </w:p>
     <w:p>
       <w:r>
-        <w:t xml:space="preserve">Delta has been in the table saw business since long before most of the other names on this list existed, and the Unisaw line is where that history shows. The 36-L352 pairs a 3 HP motor with a 52" Biesemeyer fence -- accurate to within 1/64" -- and a bi-level dust extraction system that actually keeps the cabinet interior clean instead of just claiming to. </w:t>
+        <w:t xml:space="preserve">Delta's been in the table saw business since before most of the other names on this list existed, and the Unisaw line is where that history actually shows up in the iron. The 36-L352 pairs a 3 HP motor with a 52" Biesemeyer fence -- accurate to within 1/64", which is tighter than most people's actual cutting technique -- and a bi-level dust extraction system that keeps the cabinet interior clean instead of just claiming to on the box. </w:t>
       </w:r>
       <w:hyperlink r:id="rIdLink5">
         <w:r>
@@ -363,7 +363,7 @@
     </w:p>
     <w:p>
       <w:r>
-        <w:t xml:space="preserve">If there's a default answer to "what jobsite saw should I buy," this is usually it. The rack-and-pinion fence stays accurate even after being folded up and thrown in a truck bed a hundred times, and the 32.5" rip capacity is unusually generous for something this portable. Fifteen amps, 120V, about 90 lbs with the rolling stand -- nothing on the spec sheet is exciting, and that's sort of the point. </w:t>
+        <w:t xml:space="preserve">If there's a default answer to "what jobsite saw should I buy," this is usually it. The rack-and-pinion fence stays accurate even after being folded up and thrown in a truck bed a hundred times, and the 32.5" rip capacity is unusually generous for something this portable. Fifteen amps, 120V, about 90 lbs with the rolling stand. Nothing on the spec sheet is exciting, and that's sort of the point -- it's not supposed to impress you, it's supposed to work every time you unfold it. </w:t>
       </w:r>
       <w:hyperlink r:id="rIdLink6">
         <w:r>
@@ -404,7 +404,7 @@
     </w:p>
     <w:p>
       <w:r>
-        <w:t xml:space="preserve">RIDGID's take on the same portable-saw formula trades a little of the DeWalt's polish for a friendlier price and RIDGID's lifetime service agreement, which matters more than it sounds like once a saw has spent a few years riding around in a truck bed. Folding stand, 15A motor, about 75 lbs -- close enough to the DeWalt on paper that the choice usually just comes down to whichever one's on sale. </w:t>
+        <w:t xml:space="preserve">RIDGID's take on the same portable-saw formula trades a little of the DeWalt's polish for a friendlier price and RIDGID's lifetime service agreement, which matters more than it sounds like once a saw has spent a few years riding around in a truck bed. Folding stand, 15A motor, about 75 lbs -- close enough to the DeWalt on paper that the choice usually comes down to whichever one's on sale that week. </w:t>
       </w:r>
       <w:hyperlink r:id="rIdLink7">
         <w:r>
@@ -462,7 +462,7 @@
     </w:p>
     <w:p>
       <w:r>
-        <w:t xml:space="preserve">The 2705 has been around long enough to earn a reputation most newer contractor saws haven't had time to build. The 15A motor runs smoother and quieter than most saws in its class, and it's held up well enough over the years that it still gets recommended by people whose saw is a decade old. </w:t>
+        <w:t xml:space="preserve">The 2705 has been around long enough to earn a reputation most newer contractor saws haven't had the years to build yet. The 15A motor runs smoother and quieter than most saws in its class, and it's held up well enough over time that it still gets recommended by people whose own saw is a decade old and shows no sign of quitting. </w:t>
       </w:r>
       <w:hyperlink r:id="rIdLink9">
         <w:r>
@@ -503,7 +503,7 @@
     </w:p>
     <w:p>
       <w:r>
-        <w:t xml:space="preserve">Every list like this needs a floor, and the TS6307-00 is a legitimate one, not a toy. Folding stand, a fence that actually holds its setting, and enough power to handle plywood and dimensional lumber. It's not going to replace a cabinet saw, but it's a completely reasonable first table saw for a shop that's just getting started. </w:t>
+        <w:t xml:space="preserve">Every list like this needs a floor, and the TS6307-00 is a legitimate one -- not a toy, not a compromise dressed up as a bargain. Folding stand, a fence that actually holds its setting, enough power to handle plywood and dimensional lumber without complaint. It's not going to replace a cabinet saw. It's a completely reasonable first table saw for a shop that's just getting started, which is a real category, not a consolation prize. </w:t>
       </w:r>
       <w:hyperlink r:id="rIdLink10">
         <w:r>
@@ -528,12 +528,12 @@
     </w:p>
     <w:p>
       <w:r>
-        <w:t xml:space="preserve">Jobsite and benchtop saws make sense when there's no permanent spot for one -- you're trading some accuracy for the ability to fold it up and roll it away. Contractor saws step up in power but usually keep an open base, which means dust collection is a permanent, low-grade fight. Hybrid saws close the base up and get real dust collection without the full jump to cabinet-saw weight; it's the most common landing spot for anyone who's outgrown a jobsite saw. And full cabinet saws are, simply, as good as it gets: heaviest, quietest, flattest tables, worth it once a shop has a fixed address and the saw earns its keep every day.</w:t>
-      </w:r>
-    </w:p>
-    <w:p>
-      <w:r>
-        <w:t xml:space="preserve">Whatever ends up on the floor, it's worth laying out the space around it before it shows up -- clearances, outfeed room, where the dust collection branch is going to run. That's exactly what the </w:t>
+        <w:t xml:space="preserve">Jobsite and benchtop saws make sense when there's no permanent spot for one -- you're trading some accuracy for the ability to fold it up and roll it out of the way. Contractor saws step up in power but usually keep an open base, which means dust collection is a permanent, low-grade fight you never quite win. Hybrid saws close the base up and get real dust collection without the full jump to cabinet-saw weight -- it's the most common landing spot for anyone who's outgrown a jobsite saw and knows it. And full cabinet saws are, simply, as good as it gets: heaviest, quietest, flattest tables, worth every pound once a shop has a fixed address and the saw earns its keep every single day.</w:t>
+      </w:r>
+    </w:p>
+    <w:p>
+      <w:r>
+        <w:t xml:space="preserve">Whatever ends up on the floor, it's worth laying out the space around it before it shows up -- clearances, outfeed room, where the dust collection branch is actually going to run. Figure it out on paper, not by tripping over an extension cord for the next five years. That's exactly what the </w:t>
       </w:r>
       <w:hyperlink r:id="rIdLink11">
         <w:r>

</xml_diff>